<commit_message>
Policy brief v5: evidence from the Bashkortostan branch 9-month results
</commit_message>
<xml_diff>
--- a/queries/territorial-institutions-policy-brief-20261029.docx
+++ b/queries/territorial-institutions-policy-brief-20261029.docx
@@ -71,7 +71,7 @@
         <w:pStyle w:val="Heading2"/>
       </w:pPr>
       <w:r>
-        <w:t>1. Главное в девяти тезисах</w:t>
+        <w:t>1. Главное в десяти тезисах</w:t>
       </w:r>
     </w:p>
     <w:p>
@@ -202,6 +202,20 @@
     </w:p>
     <w:p>
       <w:pPr>
+        <w:pStyle w:val="ListNumber"/>
+      </w:pPr>
+      <w:r>
+        <w:rPr>
+          <w:b/>
+        </w:rPr>
+        <w:t>Практика опережает норму — это видно по отчётности одного отделения.</w:t>
+      </w:r>
+      <w:r>
+        <w:t xml:space="preserve"> Срез по Отделению-НБ Республика Башкортостан за 9 месяцев 2026 года показывает: материалы к 6 заседаниям Совета директоров, четыре встречи с бизнес-ассоциациями с анкетированием, отраслевая врезка по строительству в региональный доклад, 15 лекций в трудовых коллективах при 80 % охвате, прирост финансовой доступности на 4,2 процентного пункта против целевых 2. Всё это уже делается, но существует как отчётность, а не как оформленный публичный продукт; и ни один показатель по немонетарным факторам инфляции в ней не встречается (раздел 2, «Что уже делается на практике»).</w:t>
+      </w:r>
+    </w:p>
+    <w:p>
+      <w:pPr>
         <w:pStyle w:val="Heading2"/>
       </w:pPr>
       <w:r>
@@ -374,227 +388,137 @@
       </w:r>
     </w:p>
     <w:p>
-      <w:pPr>
-        <w:pStyle w:val="Heading2"/>
-      </w:pPr>
-      <w:r>
-        <w:t>3. Международный опыт: что переносимо, а что нет</w:t>
-      </w:r>
-    </w:p>
-    <w:p>
       <w:r>
         <w:rPr>
           <w:b/>
         </w:rPr>
-        <w:t>США, Федеральная резервная система.</w:t>
-      </w:r>
-      <w:r>
-        <w:t xml:space="preserve"> Двенадцать резервных банков с собственными органами управления; Бежевая книга (Beige Book) собирает качественные сведения о конъюнктуре по округам и встроена в цикл заседаний FOMC (Федеральный комитет по открытому рынку). Отдельно существует функция community development: резервные банки предоставляют данные и аналитические инструменты публике и местным сообществам, ведут исследования и организуют встречи заинтересованных сторон. </w:t>
-      </w:r>
-      <w:r>
-        <w:rPr>
-          <w:i/>
-        </w:rPr>
-        <w:t>Переносимо:</w:t>
-      </w:r>
-      <w:r>
-        <w:t xml:space="preserve"> разделение «внутренний конъюнктурный сбор» и «публичная экспертиза для местных сообществ», а также формат готовых инструментов вместо индивидуальных советов. </w:t>
-      </w:r>
-      <w:r>
-        <w:rPr>
-          <w:i/>
-        </w:rPr>
-        <w:t>Не переносимо:</w:t>
-      </w:r>
-      <w:r>
-        <w:t xml:space="preserve"> институциональная конструкция резервных банков.</w:t>
+        <w:t>Что уже делается на практике.</w:t>
+      </w:r>
+      <w:r>
+        <w:t xml:space="preserve"> Ниже — срез по Отделению-НБ Республика Башкортостан за 9 месяцев 2026 года по внутренним материалам Отделения (предварительные итоги, не публикуются; имена и служебные номера не приводятся). Срез важен тем, что показывает: почти все предлагаемые направления уже существуют как работа, но не как оформленный продукт.</w:t>
       </w:r>
     </w:p>
     <w:p>
+      <w:pPr>
+        <w:pStyle w:val="ListBullet"/>
+      </w:pPr>
       <w:r>
         <w:rPr>
           <w:b/>
         </w:rPr>
-        <w:t>Великобритания, Банк Англии.</w:t>
-      </w:r>
-      <w:r>
-        <w:t xml:space="preserve"> Двенадцать агентств по стране; агенты проводят конфиденциальные встречи с предприятиями и общественными организациями и передают сведения комитетам по денежной политике, финансовой стабильности и пруденциальному регулированию. Заявленные масштабы: порядка 6 000 обсуждений, порядка 500 презентаций и около 60 поездок политиков в год. </w:t>
-      </w:r>
-      <w:r>
-        <w:rPr>
-          <w:i/>
-        </w:rPr>
-        <w:t>Переносимо:</w:t>
-      </w:r>
-      <w:r>
-        <w:t xml:space="preserve"> конфиденциальность контактов и обязанность передавать сигнал в решения, а не публиковать его. </w:t>
-      </w:r>
-      <w:r>
-        <w:rPr>
-          <w:i/>
-        </w:rPr>
-        <w:t>Не переносимо:</w:t>
-      </w:r>
-      <w:r>
-        <w:t xml:space="preserve"> масштаб — он определяется ресурсом, а не моделью.</w:t>
+        <w:t>Региональный анализ и ДКП (направление 4.1).</w:t>
+      </w:r>
+      <w:r>
+        <w:t xml:space="preserve"> Материалы подготовлены к 6 заседаниям Совета директоров; проведены 4 рабочие встречи с бизнес-ассоциациями (27.01, 07.04, 06.07 и 02.10.2026) с анкетированием, результаты учтены в материалах; по заказам центрального аппарата проведены дополнительные оперативные опросы (шаблон ДДКП, розничная торговля, климатическая повестка, осведомлённость об инструментах рынка капитала); обеспечена репрезентативность выборки мониторинга при выбытии участников.</w:t>
       </w:r>
     </w:p>
     <w:p>
+      <w:pPr>
+        <w:pStyle w:val="ListBullet"/>
+      </w:pPr>
       <w:r>
         <w:rPr>
           <w:b/>
         </w:rPr>
-        <w:t>Италия, Banca d'Italia.</w:t>
-      </w:r>
-      <w:r>
-        <w:t xml:space="preserve"> Территориальная сеть исследований готовит ежегодные отчёты об экономике каждого региона (публикуются в июне) и последующие тематические материалы. </w:t>
-      </w:r>
-      <w:r>
-        <w:rPr>
-          <w:i/>
-        </w:rPr>
-        <w:t>Переносимо:</w:t>
-      </w:r>
-      <w:r>
-        <w:t xml:space="preserve"> идея «одна территория — один регулярный отчёт с фиксированной датой», что делает экспертизу предсказуемой для органов власти. </w:t>
-      </w:r>
-      <w:r>
-        <w:rPr>
-          <w:i/>
-        </w:rPr>
-        <w:t>Не переносимо:</w:t>
-      </w:r>
-      <w:r>
-        <w:t xml:space="preserve"> бюджет и кадровая обеспеченность сети.</w:t>
+        <w:t>Отраслевая специализация «Строительство» (направления 4.1 и 4.2).</w:t>
+      </w:r>
+      <w:r>
+        <w:t xml:space="preserve"> За 9 месяцев: сюжет в «Отраслевой анализ: Q&amp;A» по рынку новостроек (выпуск от 05.06.2026), 3 квартальных Info Watch «Жилищное строительство: Россия в целом и регионы», отраслевая врезка в доклад «Региональная экономика: комментарии ГУ» (выпуск от 10.06.2026), 7 дайджестов по сегментам отрасли, профиль отрасли, краткосрочный прогноз продаж жилья, 8 дашбордов по жилищному строительству и 1 по нежилищному, доработка 3 дашбордов. Это готовый образец того, как отраслевая врезка выглядит при наличии специализации.</w:t>
       </w:r>
     </w:p>
     <w:p>
+      <w:pPr>
+        <w:pStyle w:val="ListBullet"/>
+      </w:pPr>
       <w:r>
         <w:rPr>
           <w:b/>
         </w:rPr>
-        <w:t>Германия и еврозона.</w:t>
-      </w:r>
-      <w:r>
-        <w:t xml:space="preserve"> Bundesbank работает примерно в 40 локациях (точное число филиалов официально не фиксируется); надзор в еврозоне организован через совместные надзорные группы (Joint Supervisory Teams), то есть надзорная функция выведена на наднациональный уровень. </w:t>
-      </w:r>
-      <w:r>
-        <w:rPr>
-          <w:i/>
-        </w:rPr>
-        <w:t>Переносимо:</w:t>
-      </w:r>
-      <w:r>
-        <w:t xml:space="preserve"> разделение операционной сети и надзорной вертикали — надзор не «привязан» к территории. </w:t>
-      </w:r>
-      <w:r>
-        <w:rPr>
-          <w:i/>
-        </w:rPr>
-        <w:t>Не переносимо:</w:t>
-      </w:r>
-      <w:r>
-        <w:t xml:space="preserve"> наднациональная конструкция.</w:t>
+        <w:t>Разъяснительная работа и академическое сообщество (направление 4.5).</w:t>
+      </w:r>
+      <w:r>
+        <w:t xml:space="preserve"> Два коммуникационных мероприятия для преподавателей и студентов вузов и ссузов по тематике ДКП; 4 команды вузов республики в федеральном проекте «Антимифы ДКП»; всероссийская научно-практическая конференция 26–27 марта 2026 года с участием более 400 представителей госорганов, бизнеса, ассоциаций и вузов; коммуникационная сессия для академического сообщества с презентацией учебно-методических материалов (14.10.2026); участие в региональных мероприятиях — СМИ, коллегии и совещания в региональных органах власти, отраслевые форумы.</w:t>
       </w:r>
     </w:p>
     <w:p>
+      <w:pPr>
+        <w:pStyle w:val="ListBullet"/>
+      </w:pPr>
       <w:r>
         <w:rPr>
           <w:b/>
         </w:rPr>
-        <w:t>Австралия, Reserve Bank of Australia.</w:t>
-      </w:r>
-      <w:r>
-        <w:t xml:space="preserve"> Программа связей с предприятиями, отраслевыми объединениями, органами власти и общественными организациями; часть работы выполняют небольшие региональные офисы. Банк прямо описывает контакты как дополнение к статистике и моделям, а не как регуляторное полномочие. </w:t>
-      </w:r>
-      <w:r>
-        <w:rPr>
-          <w:i/>
-        </w:rPr>
-        <w:t>Переносимо:</w:t>
-      </w:r>
-      <w:r>
-        <w:t xml:space="preserve"> компактность и явная формулировка «это дополнение к данным, а не полномочие».</w:t>
+        <w:t>Финансовая грамотность (направление 4.4).</w:t>
+      </w:r>
+      <w:r>
+        <w:t xml:space="preserve"> Программа для персонала крупной компании: 15 лекций в трудовых коллективах при 80 % охвата целевых групп, 8 видеороликов и 2 тыс. листовок; проекты «Территория без дроппов» и «Финансовый экспресс»; информационная кампания по олимпиадному движению; рост участия населения во всероссийском финансовом зачёте на фоне общего снижения интереса по стране.</w:t>
       </w:r>
     </w:p>
     <w:p>
+      <w:pPr>
+        <w:pStyle w:val="ListBullet"/>
+      </w:pPr>
       <w:r>
         <w:rPr>
           <w:b/>
         </w:rPr>
-        <w:t>Индия, RBI.</w:t>
-      </w:r>
-      <w:r>
-        <w:t xml:space="preserve"> Присутствие в 34 локациях; местные советы (Local Boards) — отдельный институт: четыре совета, по пять членов, назначаемых центральным правительством на четыре года, с ограничением общего срока восемью годами; совет консультирует Центральный совет по переданным вопросам. </w:t>
-      </w:r>
-      <w:r>
-        <w:rPr>
-          <w:i/>
-        </w:rPr>
-        <w:t>Переносимо:</w:t>
-      </w:r>
-      <w:r>
-        <w:t xml:space="preserve"> идея совещательного органа с ограниченным сроком полномочий и без права на политику. </w:t>
-      </w:r>
-      <w:r>
-        <w:rPr>
-          <w:i/>
-        </w:rPr>
-        <w:t>Не переносимо:</w:t>
-      </w:r>
-      <w:r>
-        <w:t xml:space="preserve"> сам институт — он не является органом денежно-кредитной политики и работает в иной правовой традиции.</w:t>
+        <w:t>Финансовая доступность (направление 4.4).</w:t>
+      </w:r>
+      <w:r>
+        <w:t xml:space="preserve"> Прирост коэффициента финансовой доступности на 4,2 процентного пункта против целевых 2; пять новых точек онлайн-доступа; оценка востребованности 24 действующих точек; информационные карточки для 63 муниципальных образований; изменение графиков работы отделений банка и почты в 9 муниципальных образованиях; опыт работы с «Почтой России» вынесен на федеральный уровень (12.10.2026).</w:t>
       </w:r>
     </w:p>
     <w:p>
+      <w:pPr>
+        <w:pStyle w:val="ListBullet"/>
+      </w:pPr>
       <w:r>
         <w:rPr>
           <w:b/>
         </w:rPr>
-        <w:t>Бразилия, BCB.</w:t>
-      </w:r>
-      <w:r>
-        <w:t xml:space="preserve"> Девять региональных представительств: обеспечение наличными, изучение региональной конъюнктуры, инспектирование финансовых учреждений. </w:t>
-      </w:r>
-      <w:r>
-        <w:rPr>
-          <w:i/>
-        </w:rPr>
-        <w:t>Переносимо:</w:t>
-      </w:r>
-      <w:r>
-        <w:t xml:space="preserve"> сочетание операционной, аналитической и инспекционной функций в одном офисе — то же, что и в России, с теми же рисками совмещения.</w:t>
+        <w:t>Надзорные и юрисдикционные функции (тезис 4).</w:t>
+      </w:r>
+      <w:r>
+        <w:t xml:space="preserve"> 190 мероприятий визуального контроля, выявлено 57 нарушений. По делам об административных правонарушениях рассмотрено 324 материала (321 за тот же период 2025 года), составлено 116 протоколов (181), вынесено 102 постановления (134) и 218 определений об отказе (178), обжаловано 12 процессуальных документов (14). Снижение числа протоколов при росте отказов — самостоятельный сюжет, но для справки важен сам факт: надзорный и разъяснительный контуры работают в одном подразделении.</w:t>
       </w:r>
     </w:p>
     <w:p>
+      <w:pPr>
+        <w:pStyle w:val="ListBullet"/>
+      </w:pPr>
       <w:r>
         <w:rPr>
           <w:b/>
         </w:rPr>
-        <w:t>Китай, Народный банк Китая.</w:t>
-      </w:r>
-      <w:r>
-        <w:t xml:space="preserve"> Реформа 2023 года: возвращение к провинциальному уровню, упразднение уездных подразделений; по сообщениям People's Daily и Xinhua о запуске новой сети 18.08.2023 — 31 провинциальный филиал, пять филиалов в городах с отдельным плановым статусом, 317 филиалов уровня префектур. </w:t>
-      </w:r>
-      <w:r>
-        <w:rPr>
-          <w:i/>
-        </w:rPr>
-        <w:t>Вывод:</w:t>
-      </w:r>
-      <w:r>
-        <w:t xml:space="preserve"> укрупнение сети — мировой тренд, но результаты реформы независимыми оценками не подтверждены.</w:t>
+        <w:t>Платёжная инфраструктура и финансовый рынок.</w:t>
+      </w:r>
+      <w:r>
+        <w:t xml:space="preserve"> КПЭ по популяризации СБП и цифрового рубля перевыполнен в 4,5 раза (46 мероприятий вместо 10), республика заняла 4-е место в стране по доле юридических лиц и индивидуальных предпринимателей, использующих B2B СБП (на 01.10.2026); работа по партнерскому финансированию и по стимулированию первичных размещений акций ведётся с региональными органами власти, включая созданную рабочую группу при правительстве республики.</w:t>
       </w:r>
     </w:p>
     <w:p>
+      <w:pPr>
+        <w:pStyle w:val="ListBullet"/>
+      </w:pPr>
       <w:r>
         <w:rPr>
           <w:b/>
         </w:rPr>
-        <w:t>Общий вывод по международному опыту.</w:t>
-      </w:r>
-      <w:r>
-        <w:t xml:space="preserve"> Территориальная сеть везде выполняет одно из трёх: сбор сведений для решений, операционное обслуживание, публичную экспертизу. Ни одна модель не даёт региональным властям индивидуальных финансовых рекомендаций. Российская конструкция ближе всего к бразильской по составу функций и к итальянской по потенциалу публичной региональной экспертизы.</w:t>
+        <w:t>Работа с населением и СМИ.</w:t>
+      </w:r>
+      <w:r>
+        <w:t xml:space="preserve"> Более 1000 материалов в СМИ и более 2400 в социальных сетях за 9 месяцев; пресс-завтрак с 20 главными редакторами; два креативных проекта по ДКП с региональной газетой и крупным сообществом; музей — 134 экскурсии и 2 480 посетителей; онлайн-курс по противодействию дропперству, который прошли более 6 500 граждан.</w:t>
+      </w:r>
+    </w:p>
+    <w:p>
+      <w:r>
+        <w:rPr>
+          <w:b/>
+        </w:rPr>
+        <w:t>Что из этого следует для предложений.</w:t>
+      </w:r>
+      <w:r>
+        <w:t xml:space="preserve"> Во-первых, направления 4.1–4.5 не гипотетические: они уже выполняются, а дефицит — в оформлении (нет единого продукта, адресованного внешним группам, и нет публичного формата). Во-вторых, ни в одном разделе отчёта нет ни одного показателя по немонетарным факторам инфляции — это подтверждает, что направление 4.6 действительно новое, а не переупаковка текущей работы. В-третьих, результативность измеряется числом мероприятий: КПЭ «46 вместо 10» перевыполнен, но о том, изменилось ли понимание аудитории, отчётность не говорит — ровно поэтому в разделе 9 предложен тест на понимание, а не счётчик встреч. В-четвёртых, значительная часть работы адресована органам власти и бизнес-ассоциациям, тогда как население и малый бизнес получают в основном разовые акции, — это и есть тот перекос охвата, который устраняет принцип равенства адресатов (направление 4.5).</w:t>
       </w:r>
     </w:p>
     <w:p>
@@ -602,6 +526,230 @@
         <w:pStyle w:val="Heading2"/>
       </w:pPr>
       <w:r>
+        <w:t>3. Международный опыт: что переносимо, а что нет</w:t>
+      </w:r>
+    </w:p>
+    <w:p>
+      <w:r>
+        <w:rPr>
+          <w:b/>
+        </w:rPr>
+        <w:t>США, Федеральная резервная система.</w:t>
+      </w:r>
+      <w:r>
+        <w:t xml:space="preserve"> Двенадцать резервных банков с собственными органами управления; Бежевая книга (Beige Book) собирает качественные сведения о конъюнктуре по округам и встроена в цикл заседаний FOMC (Федеральный комитет по открытому рынку). Отдельно существует функция community development: резервные банки предоставляют данные и аналитические инструменты публике и местным сообществам, ведут исследования и организуют встречи заинтересованных сторон. </w:t>
+      </w:r>
+      <w:r>
+        <w:rPr>
+          <w:i/>
+        </w:rPr>
+        <w:t>Переносимо:</w:t>
+      </w:r>
+      <w:r>
+        <w:t xml:space="preserve"> разделение «внутренний конъюнктурный сбор» и «публичная экспертиза для местных сообществ», а также формат готовых инструментов вместо индивидуальных советов. </w:t>
+      </w:r>
+      <w:r>
+        <w:rPr>
+          <w:i/>
+        </w:rPr>
+        <w:t>Не переносимо:</w:t>
+      </w:r>
+      <w:r>
+        <w:t xml:space="preserve"> институциональная конструкция резервных банков.</w:t>
+      </w:r>
+    </w:p>
+    <w:p>
+      <w:r>
+        <w:rPr>
+          <w:b/>
+        </w:rPr>
+        <w:t>Великобритания, Банк Англии.</w:t>
+      </w:r>
+      <w:r>
+        <w:t xml:space="preserve"> Двенадцать агентств по стране; агенты проводят конфиденциальные встречи с предприятиями и общественными организациями и передают сведения комитетам по денежной политике, финансовой стабильности и пруденциальному регулированию. Заявленные масштабы: порядка 6 000 обсуждений, порядка 500 презентаций и около 60 поездок политиков в год. </w:t>
+      </w:r>
+      <w:r>
+        <w:rPr>
+          <w:i/>
+        </w:rPr>
+        <w:t>Переносимо:</w:t>
+      </w:r>
+      <w:r>
+        <w:t xml:space="preserve"> конфиденциальность контактов и обязанность передавать сигнал в решения, а не публиковать его. </w:t>
+      </w:r>
+      <w:r>
+        <w:rPr>
+          <w:i/>
+        </w:rPr>
+        <w:t>Не переносимо:</w:t>
+      </w:r>
+      <w:r>
+        <w:t xml:space="preserve"> масштаб — он определяется ресурсом, а не моделью.</w:t>
+      </w:r>
+    </w:p>
+    <w:p>
+      <w:r>
+        <w:rPr>
+          <w:b/>
+        </w:rPr>
+        <w:t>Италия, Banca d'Italia.</w:t>
+      </w:r>
+      <w:r>
+        <w:t xml:space="preserve"> Территориальная сеть исследований готовит ежегодные отчёты об экономике каждого региона (публикуются в июне) и последующие тематические материалы. </w:t>
+      </w:r>
+      <w:r>
+        <w:rPr>
+          <w:i/>
+        </w:rPr>
+        <w:t>Переносимо:</w:t>
+      </w:r>
+      <w:r>
+        <w:t xml:space="preserve"> идея «одна территория — один регулярный отчёт с фиксированной датой», что делает экспертизу предсказуемой для органов власти. </w:t>
+      </w:r>
+      <w:r>
+        <w:rPr>
+          <w:i/>
+        </w:rPr>
+        <w:t>Не переносимо:</w:t>
+      </w:r>
+      <w:r>
+        <w:t xml:space="preserve"> бюджет и кадровая обеспеченность сети.</w:t>
+      </w:r>
+    </w:p>
+    <w:p>
+      <w:r>
+        <w:rPr>
+          <w:b/>
+        </w:rPr>
+        <w:t>Германия и еврозона.</w:t>
+      </w:r>
+      <w:r>
+        <w:t xml:space="preserve"> Bundesbank работает примерно в 40 локациях (точное число филиалов официально не фиксируется); надзор в еврозоне организован через совместные надзорные группы (Joint Supervisory Teams), то есть надзорная функция выведена на наднациональный уровень. </w:t>
+      </w:r>
+      <w:r>
+        <w:rPr>
+          <w:i/>
+        </w:rPr>
+        <w:t>Переносимо:</w:t>
+      </w:r>
+      <w:r>
+        <w:t xml:space="preserve"> разделение операционной сети и надзорной вертикали — надзор не «привязан» к территории. </w:t>
+      </w:r>
+      <w:r>
+        <w:rPr>
+          <w:i/>
+        </w:rPr>
+        <w:t>Не переносимо:</w:t>
+      </w:r>
+      <w:r>
+        <w:t xml:space="preserve"> наднациональная конструкция.</w:t>
+      </w:r>
+    </w:p>
+    <w:p>
+      <w:r>
+        <w:rPr>
+          <w:b/>
+        </w:rPr>
+        <w:t>Австралия, Reserve Bank of Australia.</w:t>
+      </w:r>
+      <w:r>
+        <w:t xml:space="preserve"> Программа связей с предприятиями, отраслевыми объединениями, органами власти и общественными организациями; часть работы выполняют небольшие региональные офисы. Банк прямо описывает контакты как дополнение к статистике и моделям, а не как регуляторное полномочие. </w:t>
+      </w:r>
+      <w:r>
+        <w:rPr>
+          <w:i/>
+        </w:rPr>
+        <w:t>Переносимо:</w:t>
+      </w:r>
+      <w:r>
+        <w:t xml:space="preserve"> компактность и явная формулировка «это дополнение к данным, а не полномочие».</w:t>
+      </w:r>
+    </w:p>
+    <w:p>
+      <w:r>
+        <w:rPr>
+          <w:b/>
+        </w:rPr>
+        <w:t>Индия, RBI.</w:t>
+      </w:r>
+      <w:r>
+        <w:t xml:space="preserve"> Присутствие в 34 локациях; местные советы (Local Boards) — отдельный институт: четыре совета, по пять членов, назначаемых центральным правительством на четыре года, с ограничением общего срока восемью годами; совет консультирует Центральный совет по переданным вопросам. </w:t>
+      </w:r>
+      <w:r>
+        <w:rPr>
+          <w:i/>
+        </w:rPr>
+        <w:t>Переносимо:</w:t>
+      </w:r>
+      <w:r>
+        <w:t xml:space="preserve"> идея совещательного органа с ограниченным сроком полномочий и без права на политику. </w:t>
+      </w:r>
+      <w:r>
+        <w:rPr>
+          <w:i/>
+        </w:rPr>
+        <w:t>Не переносимо:</w:t>
+      </w:r>
+      <w:r>
+        <w:t xml:space="preserve"> сам институт — он не является органом денежно-кредитной политики и работает в иной правовой традиции.</w:t>
+      </w:r>
+    </w:p>
+    <w:p>
+      <w:r>
+        <w:rPr>
+          <w:b/>
+        </w:rPr>
+        <w:t>Бразилия, BCB.</w:t>
+      </w:r>
+      <w:r>
+        <w:t xml:space="preserve"> Девять региональных представительств: обеспечение наличными, изучение региональной конъюнктуры, инспектирование финансовых учреждений. </w:t>
+      </w:r>
+      <w:r>
+        <w:rPr>
+          <w:i/>
+        </w:rPr>
+        <w:t>Переносимо:</w:t>
+      </w:r>
+      <w:r>
+        <w:t xml:space="preserve"> сочетание операционной, аналитической и инспекционной функций в одном офисе — то же, что и в России, с теми же рисками совмещения.</w:t>
+      </w:r>
+    </w:p>
+    <w:p>
+      <w:r>
+        <w:rPr>
+          <w:b/>
+        </w:rPr>
+        <w:t>Китай, Народный банк Китая.</w:t>
+      </w:r>
+      <w:r>
+        <w:t xml:space="preserve"> Реформа 2023 года: возвращение к провинциальному уровню, упразднение уездных подразделений; по сообщениям People's Daily и Xinhua о запуске новой сети 18.08.2023 — 31 провинциальный филиал, пять филиалов в городах с отдельным плановым статусом, 317 филиалов уровня префектур. </w:t>
+      </w:r>
+      <w:r>
+        <w:rPr>
+          <w:i/>
+        </w:rPr>
+        <w:t>Вывод:</w:t>
+      </w:r>
+      <w:r>
+        <w:t xml:space="preserve"> укрупнение сети — мировой тренд, но результаты реформы независимыми оценками не подтверждены.</w:t>
+      </w:r>
+    </w:p>
+    <w:p>
+      <w:r>
+        <w:rPr>
+          <w:b/>
+        </w:rPr>
+        <w:t>Общий вывод по международному опыту.</w:t>
+      </w:r>
+      <w:r>
+        <w:t xml:space="preserve"> Территориальная сеть везде выполняет одно из трёх: сбор сведений для решений, операционное обслуживание, публичную экспертизу. Ни одна модель не даёт региональным властям индивидуальных финансовых рекомендаций. Российская конструкция ближе всего к бразильской по составу функций и к итальянской по потенциалу публичной региональной экспертизы.</w:t>
+      </w:r>
+    </w:p>
+    <w:p>
+      <w:pPr>
+        <w:pStyle w:val="Heading2"/>
+      </w:pPr>
+      <w:r>
         <w:t>4. Предлагаемые задачи: шесть направлений</w:t>
       </w:r>
     </w:p>
@@ -1162,7 +1310,7 @@
         <w:t>углублённые разборы:</w:t>
       </w:r>
       <w:r>
-        <w:t xml:space="preserve"> три врезки — деловая и инвестиционная активность (с. 26), региональные и отраслевые факторы на рынке труда (с. 33), урожай 2026 года (с. 42);</w:t>
+        <w:t xml:space="preserve"> три врезки — деловая и инвестиционная активность (с. 26), региональные и отраслевые факторы на рынке труда (с. 33), урожай 2026 года (с. 42); формат врезки при этом не изобретён: в выпуске от 10.06.2026 (№ 44) отделение по специализации подготовило отраслевую врезку «Жилищное строительство», то есть механизм уже работает — не хватает не врезок, а резюме и числовой сшивки с таблицей;</w:t>
       </w:r>
     </w:p>
     <w:p>
@@ -1901,7 +2049,7 @@
         <w:t>Метрики разъяснительного контура:</w:t>
       </w:r>
       <w:r>
-        <w:t xml:space="preserve"> наличие актуальных материалов для каждой из восьми групп потребителей (цель — все восемь); доля обращений вне перечня тем, получивших мотивированный отказ (100 %); число случаев переклассификации материала в индивидуальную рекомендацию при аудите (ноль); доля ответов в регламентный срок; согласованность ответов между регионами на одинаковые вопросы; понимание материала аудиторией по тесту на comprehension (порог задаётся до пилота); равномерность охвата без концентрации на одном адресате; число инцидентов раскрытия информации ограниченного доступа (ноль).</w:t>
+        <w:t xml:space="preserve"> наличие актуальных материалов для каждой из восьми групп потребителей (цель — все восемь); доля обращений вне перечня тем, получивших мотивированный отказ (100 %); число случаев переклассификации материала в индивидуальную рекомендацию при аудите (ноль); доля ответов в регламентный срок; согласованность ответов между регионами на одинаковые вопросы; понимание материала аудиторией по тесту на comprehension (порог задаётся до пилота) — этот показатель вводится взамен счётчика мероприятий: по отчётности Отделения КПЭ по популяризации СБП перевыполнен в 4,5 раза (46 мероприятий вместо 10), но о понимании аудитории отчётность не говорит; равномерность охвата без концентрации на одном адресате; число инцидентов раскрытия информации ограниченного доступа (ноль).</w:t>
       </w:r>
     </w:p>
     <w:p>
@@ -1973,7 +2121,7 @@
         <w:t>Нагрузка.</w:t>
       </w:r>
       <w:r>
-        <w:t xml:space="preserve"> Поток обращений не оценён; лимиты трудозатрат предложены без количественной базы.</w:t>
+        <w:t xml:space="preserve"> Поток обращений не оценён; лимиты трудозатрат предложены без количественной базы. Из отчётности видно лишь косвенное: разъяснительная работа ведётся как регулярные мероприятия (лекции в трудовых коллективах, встречи с ассоциациями, сессии для академического сообщества), но нигде не сказано, сколько времени сотрудник тратит на один внешний продукт.</w:t>
       </w:r>
     </w:p>
     <w:p>
@@ -2016,6 +2164,20 @@
       </w:r>
       <w:r>
         <w:t xml:space="preserve"> Не проанализировано, как публичные контакты и регулярное взаимодействие с должностными лицами соотносится с требованиями о конфликте интересов и ограничениях на участие в рабочих группах.</w:t>
+      </w:r>
+    </w:p>
+    <w:p>
+      <w:pPr>
+        <w:pStyle w:val="ListBullet"/>
+      </w:pPr>
+      <w:r>
+        <w:rPr>
+          <w:b/>
+        </w:rPr>
+        <w:t>Наличие показателей по немонетарным факторам.</w:t>
+      </w:r>
+      <w:r>
+        <w:t xml:space="preserve"> В отчётности Отделения за 9 месяцев 2026 года нет ни одного показателя по немонетарным факторам инфляции, ни одной публикации по ним; требуется проверить, ведётся ли такая работа в других ТУ по специализациям и в каких форматах.</w:t>
       </w:r>
     </w:p>
     <w:p>

</xml_diff>